<commit_message>
feat: unify OG images, sitemap hreflang, and GEO schema
Standardise 1200x630 OG assets across all pages, generate robots.txt and sitemap at build time with bilingual hreflang, and centralise local SEO geo metadata for search and AI crawlers.

Co-authored-by: Cursor <cursoragent@cursor.com>
</commit_message>
<xml_diff>
--- a/Oakville-Marketing-Summary.docx
+++ b/Oakville-Marketing-Summary.docx
@@ -39,7 +39,7 @@
           <w:b w:val="0"/>
           <w:sz w:val="18"/>
         </w:rPr>
-        <w:t>日期：2026 年 6 月 24 日　｜oakvilles.com　｜WhatsApp 6734 9532　｜@oakville.wellness</w:t>
+        <w:t>日期：2026 年 7 月 1 日　｜oakvilles.com　｜WhatsApp 6734 9532　｜@oakville.wellness</w:t>
       </w:r>
     </w:p>
     <w:p/>
@@ -1334,6 +1334,391 @@
         <w:t>五、預算參考（每月）</w:t>
       </w:r>
     </w:p>
+    <w:p>
+      <w:pPr>
+        <w:spacing w:after="100"/>
+      </w:pPr>
+      <w:r>
+        <w:rPr>
+          <w:rFonts w:ascii="Arial" w:hAnsi="Arial" w:eastAsia="Microsoft JhengHei"/>
+          <w:b/>
+          <w:sz w:val="20"/>
+        </w:rPr>
+        <w:t>月度行銷及維護服務費 HKD 8,000（原 10,000）；內容製作（8 則社交 + 2 文）已含於月費。</w:t>
+      </w:r>
+    </w:p>
+    <w:p>
+      <w:pPr>
+        <w:spacing w:before="200" w:after="80"/>
+      </w:pPr>
+      <w:r>
+        <w:rPr>
+          <w:rFonts w:ascii="Arial" w:hAnsi="Arial" w:eastAsia="Microsoft JhengHei"/>
+          <w:b/>
+          <w:sz w:val="23"/>
+        </w:rPr>
+        <w:t>月費配置（服務費）</w:t>
+      </w:r>
+    </w:p>
+    <w:tbl>
+      <w:tblPr>
+        <w:tblStyle w:val="TableGrid"/>
+        <w:tblW w:type="auto" w:w="0"/>
+        <w:jc w:val="center"/>
+        <w:tblLook w:firstColumn="1" w:firstRow="1" w:lastColumn="0" w:lastRow="0" w:noHBand="0" w:noVBand="1" w:val="04A0"/>
+      </w:tblPr>
+      <w:tblGrid>
+        <w:gridCol w:w="3135"/>
+        <w:gridCol w:w="3135"/>
+        <w:gridCol w:w="3135"/>
+      </w:tblGrid>
+      <w:tr>
+        <w:tc>
+          <w:tcPr>
+            <w:tcW w:type="dxa" w:w="3118"/>
+            <w:shd w:fill="D5E8F0" w:val="clear"/>
+          </w:tcPr>
+          <w:p>
+            <w:r>
+              <w:rPr>
+                <w:rFonts w:ascii="Arial" w:hAnsi="Arial" w:eastAsia="Microsoft JhengHei"/>
+                <w:b/>
+                <w:sz w:val="18"/>
+              </w:rPr>
+              <w:t>項目</w:t>
+            </w:r>
+          </w:p>
+        </w:tc>
+        <w:tc>
+          <w:tcPr>
+            <w:tcW w:type="dxa" w:w="1417"/>
+            <w:shd w:fill="D5E8F0" w:val="clear"/>
+          </w:tcPr>
+          <w:p>
+            <w:r>
+              <w:rPr>
+                <w:rFonts w:ascii="Arial" w:hAnsi="Arial" w:eastAsia="Microsoft JhengHei"/>
+                <w:b/>
+                <w:sz w:val="18"/>
+              </w:rPr>
+              <w:t>HKD</w:t>
+            </w:r>
+          </w:p>
+        </w:tc>
+        <w:tc>
+          <w:tcPr>
+            <w:tcW w:type="dxa" w:w="4535"/>
+            <w:shd w:fill="D5E8F0" w:val="clear"/>
+          </w:tcPr>
+          <w:p>
+            <w:r>
+              <w:rPr>
+                <w:rFonts w:ascii="Arial" w:hAnsi="Arial" w:eastAsia="Microsoft JhengHei"/>
+                <w:b/>
+                <w:sz w:val="18"/>
+              </w:rPr>
+              <w:t>說明</w:t>
+            </w:r>
+          </w:p>
+        </w:tc>
+      </w:tr>
+      <w:tr>
+        <w:tc>
+          <w:tcPr>
+            <w:tcW w:type="dxa" w:w="3118"/>
+          </w:tcPr>
+          <w:p>
+            <w:r>
+              <w:rPr>
+                <w:rFonts w:ascii="Arial" w:hAnsi="Arial" w:eastAsia="Microsoft JhengHei"/>
+                <w:b w:val="0"/>
+                <w:sz w:val="18"/>
+              </w:rPr>
+              <w:t>Meta Facebook 代操</w:t>
+            </w:r>
+          </w:p>
+        </w:tc>
+        <w:tc>
+          <w:tcPr>
+            <w:tcW w:type="dxa" w:w="1417"/>
+          </w:tcPr>
+          <w:p>
+            <w:r>
+              <w:rPr>
+                <w:rFonts w:ascii="Arial" w:hAnsi="Arial" w:eastAsia="Microsoft JhengHei"/>
+                <w:b w:val="0"/>
+                <w:sz w:val="18"/>
+              </w:rPr>
+              <w:t>1,000</w:t>
+            </w:r>
+          </w:p>
+        </w:tc>
+        <w:tc>
+          <w:tcPr>
+            <w:tcW w:type="dxa" w:w="4535"/>
+          </w:tcPr>
+          <w:p>
+            <w:r>
+              <w:rPr>
+                <w:rFonts w:ascii="Arial" w:hAnsi="Arial" w:eastAsia="Microsoft JhengHei"/>
+                <w:b w:val="0"/>
+                <w:sz w:val="18"/>
+              </w:rPr>
+              <w:t>活動、受眾、素材、Pixel、月報</w:t>
+            </w:r>
+          </w:p>
+        </w:tc>
+      </w:tr>
+      <w:tr>
+        <w:tc>
+          <w:tcPr>
+            <w:tcW w:type="dxa" w:w="3118"/>
+          </w:tcPr>
+          <w:p>
+            <w:r>
+              <w:rPr>
+                <w:rFonts w:ascii="Arial" w:hAnsi="Arial" w:eastAsia="Microsoft JhengHei"/>
+                <w:b w:val="0"/>
+                <w:sz w:val="18"/>
+              </w:rPr>
+              <w:t>Meta Instagram 代操</w:t>
+            </w:r>
+          </w:p>
+        </w:tc>
+        <w:tc>
+          <w:tcPr>
+            <w:tcW w:type="dxa" w:w="1417"/>
+          </w:tcPr>
+          <w:p>
+            <w:r>
+              <w:rPr>
+                <w:rFonts w:ascii="Arial" w:hAnsi="Arial" w:eastAsia="Microsoft JhengHei"/>
+                <w:b w:val="0"/>
+                <w:sz w:val="18"/>
+              </w:rPr>
+              <w:t>1,000</w:t>
+            </w:r>
+          </w:p>
+        </w:tc>
+        <w:tc>
+          <w:tcPr>
+            <w:tcW w:type="dxa" w:w="4535"/>
+          </w:tcPr>
+          <w:p>
+            <w:r>
+              <w:rPr>
+                <w:rFonts w:ascii="Arial" w:hAnsi="Arial" w:eastAsia="Microsoft JhengHei"/>
+                <w:b w:val="0"/>
+                <w:sz w:val="18"/>
+              </w:rPr>
+              <w:t>Reels/Stories、IG 受眾優化</w:t>
+            </w:r>
+          </w:p>
+        </w:tc>
+      </w:tr>
+      <w:tr>
+        <w:tc>
+          <w:tcPr>
+            <w:tcW w:type="dxa" w:w="3118"/>
+          </w:tcPr>
+          <w:p>
+            <w:r>
+              <w:rPr>
+                <w:rFonts w:ascii="Arial" w:hAnsi="Arial" w:eastAsia="Microsoft JhengHei"/>
+                <w:b w:val="0"/>
+                <w:sz w:val="18"/>
+              </w:rPr>
+              <w:t>Google 搜尋代操</w:t>
+            </w:r>
+          </w:p>
+        </w:tc>
+        <w:tc>
+          <w:tcPr>
+            <w:tcW w:type="dxa" w:w="1417"/>
+          </w:tcPr>
+          <w:p>
+            <w:r>
+              <w:rPr>
+                <w:rFonts w:ascii="Arial" w:hAnsi="Arial" w:eastAsia="Microsoft JhengHei"/>
+                <w:b w:val="0"/>
+                <w:sz w:val="18"/>
+              </w:rPr>
+              <w:t>3,000</w:t>
+            </w:r>
+          </w:p>
+        </w:tc>
+        <w:tc>
+          <w:tcPr>
+            <w:tcW w:type="dxa" w:w="4535"/>
+          </w:tcPr>
+          <w:p>
+            <w:r>
+              <w:rPr>
+                <w:rFonts w:ascii="Arial" w:hAnsi="Arial" w:eastAsia="Microsoft JhengHei"/>
+                <w:b w:val="0"/>
+                <w:sz w:val="18"/>
+              </w:rPr>
+              <w:t>品牌+中環+症狀 Search</w:t>
+            </w:r>
+          </w:p>
+        </w:tc>
+      </w:tr>
+      <w:tr>
+        <w:tc>
+          <w:tcPr>
+            <w:tcW w:type="dxa" w:w="3118"/>
+          </w:tcPr>
+          <w:p>
+            <w:r>
+              <w:rPr>
+                <w:rFonts w:ascii="Arial" w:hAnsi="Arial" w:eastAsia="Microsoft JhengHei"/>
+                <w:b w:val="0"/>
+                <w:sz w:val="18"/>
+              </w:rPr>
+              <w:t>內容製作（8 則社交 + 2 文）</w:t>
+            </w:r>
+          </w:p>
+        </w:tc>
+        <w:tc>
+          <w:tcPr>
+            <w:tcW w:type="dxa" w:w="1417"/>
+          </w:tcPr>
+          <w:p>
+            <w:r>
+              <w:rPr>
+                <w:rFonts w:ascii="Arial" w:hAnsi="Arial" w:eastAsia="Microsoft JhengHei"/>
+                <w:b w:val="0"/>
+                <w:sz w:val="18"/>
+              </w:rPr>
+              <w:t>月費包含</w:t>
+            </w:r>
+          </w:p>
+        </w:tc>
+        <w:tc>
+          <w:tcPr>
+            <w:tcW w:type="dxa" w:w="4535"/>
+          </w:tcPr>
+          <w:p>
+            <w:r>
+              <w:rPr>
+                <w:rFonts w:ascii="Arial" w:hAnsi="Arial" w:eastAsia="Microsoft JhengHei"/>
+                <w:b w:val="0"/>
+                <w:sz w:val="18"/>
+              </w:rPr>
+              <w:t>不再另收 3,000–6,000</w:t>
+            </w:r>
+          </w:p>
+        </w:tc>
+      </w:tr>
+      <w:tr>
+        <w:tc>
+          <w:tcPr>
+            <w:tcW w:type="dxa" w:w="3118"/>
+          </w:tcPr>
+          <w:p>
+            <w:r>
+              <w:rPr>
+                <w:rFonts w:ascii="Arial" w:hAnsi="Arial" w:eastAsia="Microsoft JhengHei"/>
+                <w:b w:val="0"/>
+                <w:sz w:val="18"/>
+              </w:rPr>
+              <w:t>策略·維護·會議</w:t>
+            </w:r>
+          </w:p>
+        </w:tc>
+        <w:tc>
+          <w:tcPr>
+            <w:tcW w:type="dxa" w:w="1417"/>
+          </w:tcPr>
+          <w:p>
+            <w:r>
+              <w:rPr>
+                <w:rFonts w:ascii="Arial" w:hAnsi="Arial" w:eastAsia="Microsoft JhengHei"/>
+                <w:b w:val="0"/>
+                <w:sz w:val="18"/>
+              </w:rPr>
+              <w:t>月費包含</w:t>
+            </w:r>
+          </w:p>
+        </w:tc>
+        <w:tc>
+          <w:tcPr>
+            <w:tcW w:type="dxa" w:w="4535"/>
+          </w:tcPr>
+          <w:p>
+            <w:r>
+              <w:rPr>
+                <w:rFonts w:ascii="Arial" w:hAnsi="Arial" w:eastAsia="Microsoft JhengHei"/>
+                <w:b w:val="0"/>
+                <w:sz w:val="18"/>
+              </w:rPr>
+              <w:t>GBP、GA4 月報、網站小修、月度檢討</w:t>
+            </w:r>
+          </w:p>
+        </w:tc>
+      </w:tr>
+      <w:tr>
+        <w:tc>
+          <w:tcPr>
+            <w:tcW w:type="dxa" w:w="3118"/>
+          </w:tcPr>
+          <w:p>
+            <w:r>
+              <w:rPr>
+                <w:rFonts w:ascii="Arial" w:hAnsi="Arial" w:eastAsia="Microsoft JhengHei"/>
+                <w:b w:val="0"/>
+                <w:sz w:val="18"/>
+              </w:rPr>
+              <w:t>月度服務費合計</w:t>
+            </w:r>
+          </w:p>
+        </w:tc>
+        <w:tc>
+          <w:tcPr>
+            <w:tcW w:type="dxa" w:w="1417"/>
+          </w:tcPr>
+          <w:p>
+            <w:r>
+              <w:rPr>
+                <w:rFonts w:ascii="Arial" w:hAnsi="Arial" w:eastAsia="Microsoft JhengHei"/>
+                <w:b w:val="0"/>
+                <w:sz w:val="18"/>
+              </w:rPr>
+              <w:t>8,000</w:t>
+            </w:r>
+          </w:p>
+        </w:tc>
+        <w:tc>
+          <w:tcPr>
+            <w:tcW w:type="dxa" w:w="4535"/>
+          </w:tcPr>
+          <w:p>
+            <w:r>
+              <w:rPr>
+                <w:rFonts w:ascii="Arial" w:hAnsi="Arial" w:eastAsia="Microsoft JhengHei"/>
+                <w:b w:val="0"/>
+                <w:sz w:val="18"/>
+              </w:rPr>
+              <w:t>不含平台廣告投放費</w:t>
+            </w:r>
+          </w:p>
+        </w:tc>
+      </w:tr>
+    </w:tbl>
+    <w:p/>
+    <w:p>
+      <w:pPr>
+        <w:spacing w:before="200" w:after="80"/>
+      </w:pPr>
+      <w:r>
+        <w:rPr>
+          <w:rFonts w:ascii="Arial" w:hAnsi="Arial" w:eastAsia="Microsoft JhengHei"/>
+          <w:b/>
+          <w:sz w:val="23"/>
+        </w:rPr>
+        <w:t>建議廣告投放（客戶直付平台）</w:t>
+      </w:r>
+    </w:p>
     <w:tbl>
       <w:tblPr>
         <w:tblStyle w:val="TableGrid"/>
@@ -1391,7 +1776,7 @@
                 <w:b w:val="0"/>
                 <w:sz w:val="18"/>
               </w:rPr>
-              <w:t>Meta 廣告</w:t>
+              <w:t>Meta Facebook</w:t>
             </w:r>
           </w:p>
         </w:tc>
@@ -1406,7 +1791,39 @@
                 <w:b w:val="0"/>
                 <w:sz w:val="18"/>
               </w:rPr>
-              <w:t>5,000 – 8,000</w:t>
+              <w:t>1,000</w:t>
+            </w:r>
+          </w:p>
+        </w:tc>
+      </w:tr>
+      <w:tr>
+        <w:tc>
+          <w:tcPr>
+            <w:tcW w:type="dxa" w:w="5669"/>
+          </w:tcPr>
+          <w:p>
+            <w:r>
+              <w:rPr>
+                <w:rFonts w:ascii="Arial" w:hAnsi="Arial" w:eastAsia="Microsoft JhengHei"/>
+                <w:b w:val="0"/>
+                <w:sz w:val="18"/>
+              </w:rPr>
+              <w:t>Meta Instagram</w:t>
+            </w:r>
+          </w:p>
+        </w:tc>
+        <w:tc>
+          <w:tcPr>
+            <w:tcW w:type="dxa" w:w="3402"/>
+          </w:tcPr>
+          <w:p>
+            <w:r>
+              <w:rPr>
+                <w:rFonts w:ascii="Arial" w:hAnsi="Arial" w:eastAsia="Microsoft JhengHei"/>
+                <w:b w:val="0"/>
+                <w:sz w:val="18"/>
+              </w:rPr>
+              <w:t>1,000</w:t>
             </w:r>
           </w:p>
         </w:tc>
@@ -1438,7 +1855,7 @@
                 <w:b w:val="0"/>
                 <w:sz w:val="18"/>
               </w:rPr>
-              <w:t>5,000 – 8,000</w:t>
+              <w:t>3,000</w:t>
             </w:r>
           </w:p>
         </w:tc>
@@ -1455,7 +1872,7 @@
                 <w:b w:val="0"/>
                 <w:sz w:val="18"/>
               </w:rPr>
-              <w:t>內容製作（8 則社交 + 2 文）</w:t>
+              <w:t>內容製作</w:t>
             </w:r>
           </w:p>
         </w:tc>
@@ -1470,7 +1887,7 @@
                 <w:b w:val="0"/>
                 <w:sz w:val="18"/>
               </w:rPr>
-              <w:t>3,000 – 6,000</w:t>
+              <w:t>—（已含月費）</w:t>
             </w:r>
           </w:p>
         </w:tc>
@@ -1487,7 +1904,7 @@
                 <w:b w:val="0"/>
                 <w:sz w:val="18"/>
               </w:rPr>
-              <w:t>合計</w:t>
+              <w:t>客戶每月合計（服務+廣告）</w:t>
             </w:r>
           </w:p>
         </w:tc>
@@ -1502,7 +1919,272 @@
                 <w:b w:val="0"/>
                 <w:sz w:val="18"/>
               </w:rPr>
-              <w:t>約 13,000 – 22,000</w:t>
+              <w:t>約 13,000</w:t>
+            </w:r>
+          </w:p>
+        </w:tc>
+      </w:tr>
+    </w:tbl>
+    <w:p/>
+    <w:p>
+      <w:pPr>
+        <w:spacing w:before="200" w:after="80"/>
+      </w:pPr>
+      <w:r>
+        <w:rPr>
+          <w:rFonts w:ascii="Arial" w:hAnsi="Arial" w:eastAsia="Microsoft JhengHei"/>
+          <w:b/>
+          <w:sz w:val="23"/>
+        </w:rPr>
+        <w:t>價格調整前後</w:t>
+      </w:r>
+    </w:p>
+    <w:tbl>
+      <w:tblPr>
+        <w:tblStyle w:val="TableGrid"/>
+        <w:tblW w:type="auto" w:w="0"/>
+        <w:jc w:val="center"/>
+        <w:tblLook w:firstColumn="1" w:firstRow="1" w:lastColumn="0" w:lastRow="0" w:noHBand="0" w:noVBand="1" w:val="04A0"/>
+      </w:tblPr>
+      <w:tblGrid>
+        <w:gridCol w:w="3135"/>
+        <w:gridCol w:w="3135"/>
+        <w:gridCol w:w="3135"/>
+      </w:tblGrid>
+      <w:tr>
+        <w:tc>
+          <w:tcPr>
+            <w:tcW w:type="dxa" w:w="2835"/>
+            <w:shd w:fill="D5E8F0" w:val="clear"/>
+          </w:tcPr>
+          <w:p>
+            <w:r>
+              <w:rPr>
+                <w:rFonts w:ascii="Arial" w:hAnsi="Arial" w:eastAsia="Microsoft JhengHei"/>
+                <w:b/>
+                <w:sz w:val="18"/>
+              </w:rPr>
+              <w:t>項目</w:t>
+            </w:r>
+          </w:p>
+        </w:tc>
+        <w:tc>
+          <w:tcPr>
+            <w:tcW w:type="dxa" w:w="2835"/>
+            <w:shd w:fill="D5E8F0" w:val="clear"/>
+          </w:tcPr>
+          <w:p>
+            <w:r>
+              <w:rPr>
+                <w:rFonts w:ascii="Arial" w:hAnsi="Arial" w:eastAsia="Microsoft JhengHei"/>
+                <w:b/>
+                <w:sz w:val="18"/>
+              </w:rPr>
+              <w:t>調整前</w:t>
+            </w:r>
+          </w:p>
+        </w:tc>
+        <w:tc>
+          <w:tcPr>
+            <w:tcW w:type="dxa" w:w="3402"/>
+            <w:shd w:fill="D5E8F0" w:val="clear"/>
+          </w:tcPr>
+          <w:p>
+            <w:r>
+              <w:rPr>
+                <w:rFonts w:ascii="Arial" w:hAnsi="Arial" w:eastAsia="Microsoft JhengHei"/>
+                <w:b/>
+                <w:sz w:val="18"/>
+              </w:rPr>
+              <w:t>調整後</w:t>
+            </w:r>
+          </w:p>
+        </w:tc>
+      </w:tr>
+      <w:tr>
+        <w:tc>
+          <w:tcPr>
+            <w:tcW w:type="dxa" w:w="2835"/>
+          </w:tcPr>
+          <w:p>
+            <w:r>
+              <w:rPr>
+                <w:rFonts w:ascii="Arial" w:hAnsi="Arial" w:eastAsia="Microsoft JhengHei"/>
+                <w:b w:val="0"/>
+                <w:sz w:val="18"/>
+              </w:rPr>
+              <w:t>月度服務費</w:t>
+            </w:r>
+          </w:p>
+        </w:tc>
+        <w:tc>
+          <w:tcPr>
+            <w:tcW w:type="dxa" w:w="2835"/>
+          </w:tcPr>
+          <w:p>
+            <w:r>
+              <w:rPr>
+                <w:rFonts w:ascii="Arial" w:hAnsi="Arial" w:eastAsia="Microsoft JhengHei"/>
+                <w:b w:val="0"/>
+                <w:sz w:val="18"/>
+              </w:rPr>
+              <w:t>10,000</w:t>
+            </w:r>
+          </w:p>
+        </w:tc>
+        <w:tc>
+          <w:tcPr>
+            <w:tcW w:type="dxa" w:w="3402"/>
+          </w:tcPr>
+          <w:p>
+            <w:r>
+              <w:rPr>
+                <w:rFonts w:ascii="Arial" w:hAnsi="Arial" w:eastAsia="Microsoft JhengHei"/>
+                <w:b w:val="0"/>
+                <w:sz w:val="18"/>
+              </w:rPr>
+              <w:t>8,000</w:t>
+            </w:r>
+          </w:p>
+        </w:tc>
+      </w:tr>
+      <w:tr>
+        <w:tc>
+          <w:tcPr>
+            <w:tcW w:type="dxa" w:w="2835"/>
+          </w:tcPr>
+          <w:p>
+            <w:r>
+              <w:rPr>
+                <w:rFonts w:ascii="Arial" w:hAnsi="Arial" w:eastAsia="Microsoft JhengHei"/>
+                <w:b w:val="0"/>
+                <w:sz w:val="18"/>
+              </w:rPr>
+              <w:t>內容製作</w:t>
+            </w:r>
+          </w:p>
+        </w:tc>
+        <w:tc>
+          <w:tcPr>
+            <w:tcW w:type="dxa" w:w="2835"/>
+          </w:tcPr>
+          <w:p>
+            <w:r>
+              <w:rPr>
+                <w:rFonts w:ascii="Arial" w:hAnsi="Arial" w:eastAsia="Microsoft JhengHei"/>
+                <w:b w:val="0"/>
+                <w:sz w:val="18"/>
+              </w:rPr>
+              <w:t>另計 3,000–6,000</w:t>
+            </w:r>
+          </w:p>
+        </w:tc>
+        <w:tc>
+          <w:tcPr>
+            <w:tcW w:type="dxa" w:w="3402"/>
+          </w:tcPr>
+          <w:p>
+            <w:r>
+              <w:rPr>
+                <w:rFonts w:ascii="Arial" w:hAnsi="Arial" w:eastAsia="Microsoft JhengHei"/>
+                <w:b w:val="0"/>
+                <w:sz w:val="18"/>
+              </w:rPr>
+              <w:t>月費包含</w:t>
+            </w:r>
+          </w:p>
+        </w:tc>
+      </w:tr>
+      <w:tr>
+        <w:tc>
+          <w:tcPr>
+            <w:tcW w:type="dxa" w:w="2835"/>
+          </w:tcPr>
+          <w:p>
+            <w:r>
+              <w:rPr>
+                <w:rFonts w:ascii="Arial" w:hAnsi="Arial" w:eastAsia="Microsoft JhengHei"/>
+                <w:b w:val="0"/>
+                <w:sz w:val="18"/>
+              </w:rPr>
+              <w:t>Meta</w:t>
+            </w:r>
+          </w:p>
+        </w:tc>
+        <w:tc>
+          <w:tcPr>
+            <w:tcW w:type="dxa" w:w="2835"/>
+          </w:tcPr>
+          <w:p>
+            <w:r>
+              <w:rPr>
+                <w:rFonts w:ascii="Arial" w:hAnsi="Arial" w:eastAsia="Microsoft JhengHei"/>
+                <w:b w:val="0"/>
+                <w:sz w:val="18"/>
+              </w:rPr>
+              <w:t>合併 5,000–8,000</w:t>
+            </w:r>
+          </w:p>
+        </w:tc>
+        <w:tc>
+          <w:tcPr>
+            <w:tcW w:type="dxa" w:w="3402"/>
+          </w:tcPr>
+          <w:p>
+            <w:r>
+              <w:rPr>
+                <w:rFonts w:ascii="Arial" w:hAnsi="Arial" w:eastAsia="Microsoft JhengHei"/>
+                <w:b w:val="0"/>
+                <w:sz w:val="18"/>
+              </w:rPr>
+              <w:t>FB 1,000 + IG 1,000</w:t>
+            </w:r>
+          </w:p>
+        </w:tc>
+      </w:tr>
+      <w:tr>
+        <w:tc>
+          <w:tcPr>
+            <w:tcW w:type="dxa" w:w="2835"/>
+          </w:tcPr>
+          <w:p>
+            <w:r>
+              <w:rPr>
+                <w:rFonts w:ascii="Arial" w:hAnsi="Arial" w:eastAsia="Microsoft JhengHei"/>
+                <w:b w:val="0"/>
+                <w:sz w:val="18"/>
+              </w:rPr>
+              <w:t>Google</w:t>
+            </w:r>
+          </w:p>
+        </w:tc>
+        <w:tc>
+          <w:tcPr>
+            <w:tcW w:type="dxa" w:w="2835"/>
+          </w:tcPr>
+          <w:p>
+            <w:r>
+              <w:rPr>
+                <w:rFonts w:ascii="Arial" w:hAnsi="Arial" w:eastAsia="Microsoft JhengHei"/>
+                <w:b w:val="0"/>
+                <w:sz w:val="18"/>
+              </w:rPr>
+              <w:t>5,000–8,000</w:t>
+            </w:r>
+          </w:p>
+        </w:tc>
+        <w:tc>
+          <w:tcPr>
+            <w:tcW w:type="dxa" w:w="3402"/>
+          </w:tcPr>
+          <w:p>
+            <w:r>
+              <w:rPr>
+                <w:rFonts w:ascii="Arial" w:hAnsi="Arial" w:eastAsia="Microsoft JhengHei"/>
+                <w:b w:val="0"/>
+                <w:sz w:val="18"/>
+              </w:rPr>
+              <w:t>3,000</w:t>
             </w:r>
           </w:p>
         </w:tc>
@@ -1519,7 +2201,7 @@
           <w:b w:val="0"/>
           <w:sz w:val="20"/>
         </w:rPr>
-        <w:t>建議先各投 3,000 試跑 4–6 週，看單次 WA 點擊成本再調整。</w:t>
+        <w:t>建議試跑 4–6 週，依 whatsapp_click 成本再調整廣告 spend。</w:t>
       </w:r>
     </w:p>
     <w:p>

</xml_diff>